<commit_message>
added repo link to docs
</commit_message>
<xml_diff>
--- a/Kaggle_MALLORN.docx
+++ b/Kaggle_MALLORN.docx
@@ -385,6 +385,7 @@
       </w:pPr>
       <w:r>
         <w:rPr>
+          <w:noProof/>
           <w:sz w:val="21"/>
           <w:szCs w:val="21"/>
         </w:rPr>
@@ -441,25 +442,7 @@
           <w:sz w:val="19"/>
           <w:szCs w:val="19"/>
         </w:rPr>
-        <w:t xml:space="preserve">Figure 1: </w:t>
-      </w:r>
-      <w:r>
-        <w:rPr>
-          <w:i/>
-          <w:iCs/>
-          <w:sz w:val="19"/>
-          <w:szCs w:val="19"/>
-        </w:rPr>
-        <w:t>Final Kaggle scores using the submission spreadsheet</w:t>
-      </w:r>
-      <w:r>
-        <w:rPr>
-          <w:i/>
-          <w:iCs/>
-          <w:sz w:val="19"/>
-          <w:szCs w:val="19"/>
-        </w:rPr>
-        <w:t>.</w:t>
+        <w:t>Figure 1: Final Kaggle scores using the submission spreadsheet.</w:t>
       </w:r>
     </w:p>
     <w:p>
@@ -1676,6 +1659,73 @@
         </w:rPr>
         <w:t>/* function as runtime caches. If removed, the pipeline will rebuild them automatically, although Gaussian Process fitting can be computationally expensive. Generated plots are stored in plots/, while archival visuals reside in graphs/.</w:t>
       </w:r>
+    </w:p>
+    <w:p>
+      <w:pPr>
+        <w:spacing w:after="140"/>
+        <w:jc w:val="both"/>
+        <w:rPr>
+          <w:sz w:val="21"/>
+          <w:szCs w:val="21"/>
+        </w:rPr>
+      </w:pPr>
+    </w:p>
+    <w:p>
+      <w:pPr>
+        <w:spacing w:after="140"/>
+        <w:jc w:val="both"/>
+        <w:rPr>
+          <w:b/>
+          <w:bCs/>
+          <w:sz w:val="21"/>
+          <w:szCs w:val="21"/>
+        </w:rPr>
+      </w:pPr>
+      <w:r>
+        <w:rPr>
+          <w:b/>
+          <w:bCs/>
+          <w:sz w:val="21"/>
+          <w:szCs w:val="21"/>
+        </w:rPr>
+        <w:t>GitHub Repository</w:t>
+      </w:r>
+    </w:p>
+    <w:p>
+      <w:pPr>
+        <w:spacing w:after="140"/>
+        <w:jc w:val="both"/>
+        <w:rPr>
+          <w:sz w:val="21"/>
+          <w:szCs w:val="21"/>
+        </w:rPr>
+      </w:pPr>
+      <w:hyperlink r:id="rId14" w:history="1">
+        <w:r>
+          <w:rPr>
+            <w:rStyle w:val="Hyperlink"/>
+            <w:sz w:val="21"/>
+            <w:szCs w:val="21"/>
+          </w:rPr>
+          <w:t>https://github.com/CarlKo-DLSU/DEEPLRN_Kaggle_MALLOR</w:t>
+        </w:r>
+        <w:r>
+          <w:rPr>
+            <w:rStyle w:val="Hyperlink"/>
+            <w:sz w:val="21"/>
+            <w:szCs w:val="21"/>
+          </w:rPr>
+          <w:t>N</w:t>
+        </w:r>
+        <w:r>
+          <w:rPr>
+            <w:rStyle w:val="Hyperlink"/>
+            <w:sz w:val="21"/>
+            <w:szCs w:val="21"/>
+          </w:rPr>
+          <w:t>.git</w:t>
+        </w:r>
+      </w:hyperlink>
     </w:p>
     <w:sectPr>
       <w:pgSz w:w="12240" w:h="15840"/>
@@ -2365,6 +2415,41 @@
     <w:uiPriority w:val="99"/>
     <w:rsid w:val="00A503C5"/>
   </w:style>
+  <w:style w:type="character" w:styleId="Hyperlink">
+    <w:name w:val="Hyperlink"/>
+    <w:basedOn w:val="DefaultParagraphFont"/>
+    <w:uiPriority w:val="99"/>
+    <w:unhideWhenUsed/>
+    <w:rsid w:val="002066A6"/>
+    <w:rPr>
+      <w:color w:val="0000FF" w:themeColor="hyperlink"/>
+      <w:u w:val="single"/>
+    </w:rPr>
+  </w:style>
+  <w:style w:type="character" w:styleId="UnresolvedMention">
+    <w:name w:val="Unresolved Mention"/>
+    <w:basedOn w:val="DefaultParagraphFont"/>
+    <w:uiPriority w:val="99"/>
+    <w:semiHidden/>
+    <w:unhideWhenUsed/>
+    <w:rsid w:val="002066A6"/>
+    <w:rPr>
+      <w:color w:val="605E5C"/>
+      <w:shd w:val="clear" w:color="auto" w:fill="E1DFDD"/>
+    </w:rPr>
+  </w:style>
+  <w:style w:type="character" w:styleId="FollowedHyperlink">
+    <w:name w:val="FollowedHyperlink"/>
+    <w:basedOn w:val="DefaultParagraphFont"/>
+    <w:uiPriority w:val="99"/>
+    <w:semiHidden/>
+    <w:unhideWhenUsed/>
+    <w:rsid w:val="002066A6"/>
+    <w:rPr>
+      <w:color w:val="800080" w:themeColor="followedHyperlink"/>
+      <w:u w:val="single"/>
+    </w:rPr>
+  </w:style>
 </w:styles>
 </file>
 

</xml_diff>